<commit_message>
Refactor de rutas con PathManager y preparación para distribución
</commit_message>
<xml_diff>
--- a/app/assets/templates/AVISO DE SINIESTRO DAÑOS VEHICULOS.docx
+++ b/app/assets/templates/AVISO DE SINIESTRO DAÑOS VEHICULOS.docx
@@ -4,6 +4,7 @@
   <w:body>
     <w:p>
       <w:pPr>
+        <w:ind w:left="4956" w:hanging="708"/>
         <w:rPr>
           <w:rFonts w:ascii="Bookman Old Style" w:hAnsi="Bookman Old Style"/>
           <w:b/>
@@ -36,18 +37,84 @@
       </w:r>
       <w:r>
         <w:rPr>
+          <w:sz w:val="20"/>
+        </w:rPr>
+        <w:t>{{</w:t>
+      </w:r>
+      <w:proofErr w:type="spellStart"/>
+      <w:r>
+        <w:rPr>
+          <w:sz w:val="20"/>
+        </w:rPr>
+        <w:t>numero_interno</w:t>
+      </w:r>
+      <w:proofErr w:type="spellEnd"/>
+      <w:r>
+        <w:rPr>
+          <w:sz w:val="20"/>
+        </w:rPr>
+        <w:t>}}</w:t>
+      </w:r>
+    </w:p>
+    <w:p>
+      <w:pPr>
+        <w:jc w:val="center"/>
+        <w:rPr>
           <w:rFonts w:ascii="Bookman Old Style" w:hAnsi="Bookman Old Style"/>
           <w:b/>
           <w:bCs/>
           <w:color w:val="000000" w:themeColor="text1"/>
           <w:u w:val="single"/>
         </w:rPr>
-        <w:t>6472</w:t>
+      </w:pPr>
+    </w:p>
+    <w:p>
+      <w:pPr>
+        <w:jc w:val="center"/>
+        <w:rPr>
+          <w:rFonts w:ascii="Bookman Old Style" w:hAnsi="Bookman Old Style"/>
+          <w:color w:val="000000" w:themeColor="text1"/>
+          <w:u w:val="single"/>
+        </w:rPr>
+      </w:pPr>
+      <w:r>
+        <w:rPr>
+          <w:rFonts w:ascii="Bookman Old Style" w:hAnsi="Bookman Old Style"/>
+          <w:color w:val="000000" w:themeColor="text1"/>
+          <w:u w:val="single"/>
+        </w:rPr>
+        <w:t>AVISO DE SINIESTRO - Daños materiales Vehículos</w:t>
       </w:r>
+      <w:r>
+        <w:rPr>
+          <w:rFonts w:ascii="Bookman Old Style" w:hAnsi="Bookman Old Style"/>
+          <w:color w:val="000000" w:themeColor="text1"/>
+          <w:u w:val="single"/>
+        </w:rPr>
+        <w:t xml:space="preserve"> </w:t>
+      </w:r>
     </w:p>
     <w:p>
       <w:pPr>
         <w:jc w:val="center"/>
+        <w:rPr>
+          <w:rFonts w:ascii="Bookman Old Style" w:hAnsi="Bookman Old Style"/>
+          <w:color w:val="000000" w:themeColor="text1"/>
+          <w:u w:val="single"/>
+        </w:rPr>
+      </w:pPr>
+    </w:p>
+    <w:p>
+      <w:pPr>
+        <w:rPr>
+          <w:rFonts w:ascii="Bookman Old Style" w:hAnsi="Bookman Old Style"/>
+          <w:color w:val="000000" w:themeColor="text1"/>
+        </w:rPr>
+      </w:pPr>
+    </w:p>
+    <w:p>
+      <w:pPr>
+        <w:jc w:val="both"/>
         <w:rPr>
           <w:rFonts w:ascii="Bookman Old Style" w:hAnsi="Bookman Old Style"/>
           <w:b/>
@@ -56,10 +123,14 @@
           <w:u w:val="single"/>
         </w:rPr>
       </w:pPr>
-    </w:p>
-    <w:p>
-      <w:pPr>
-        <w:jc w:val="center"/>
+      <w:r>
+        <w:rPr>
+          <w:rFonts w:ascii="Bookman Old Style" w:hAnsi="Bookman Old Style"/>
+          <w:color w:val="000000" w:themeColor="text1"/>
+        </w:rPr>
+        <w:t xml:space="preserve">Fecha reclamación: </w:t>
+      </w:r>
+      <w:r>
         <w:rPr>
           <w:rFonts w:ascii="Bookman Old Style" w:hAnsi="Bookman Old Style"/>
           <w:b/>
@@ -67,55 +138,10 @@
           <w:color w:val="000000" w:themeColor="text1"/>
           <w:u w:val="single"/>
         </w:rPr>
-      </w:pPr>
-    </w:p>
-    <w:p>
-      <w:pPr>
-        <w:jc w:val="center"/>
-        <w:rPr>
-          <w:rFonts w:ascii="Bookman Old Style" w:hAnsi="Bookman Old Style"/>
-          <w:color w:val="000000" w:themeColor="text1"/>
-          <w:u w:val="single"/>
-        </w:rPr>
-      </w:pPr>
+        <w:t>{{</w:t>
+      </w:r>
+      <w:proofErr w:type="spellStart"/>
       <w:r>
-        <w:rPr>
-          <w:rFonts w:ascii="Bookman Old Style" w:hAnsi="Bookman Old Style"/>
-          <w:color w:val="000000" w:themeColor="text1"/>
-          <w:u w:val="single"/>
-        </w:rPr>
-        <w:t>AVISO DE SINIESTRO - Daños materiales Vehículos</w:t>
-      </w:r>
-      <w:r>
-        <w:rPr>
-          <w:rFonts w:ascii="Bookman Old Style" w:hAnsi="Bookman Old Style"/>
-          <w:color w:val="000000" w:themeColor="text1"/>
-          <w:u w:val="single"/>
-        </w:rPr>
-        <w:t xml:space="preserve"> </w:t>
-      </w:r>
-    </w:p>
-    <w:p>
-      <w:pPr>
-        <w:jc w:val="center"/>
-        <w:rPr>
-          <w:rFonts w:ascii="Bookman Old Style" w:hAnsi="Bookman Old Style"/>
-          <w:color w:val="000000" w:themeColor="text1"/>
-          <w:u w:val="single"/>
-        </w:rPr>
-      </w:pPr>
-    </w:p>
-    <w:p>
-      <w:pPr>
-        <w:rPr>
-          <w:rFonts w:ascii="Bookman Old Style" w:hAnsi="Bookman Old Style"/>
-          <w:color w:val="000000" w:themeColor="text1"/>
-        </w:rPr>
-      </w:pPr>
-    </w:p>
-    <w:p>
-      <w:pPr>
-        <w:jc w:val="both"/>
         <w:rPr>
           <w:rFonts w:ascii="Bookman Old Style" w:hAnsi="Bookman Old Style"/>
           <w:b/>
@@ -123,14 +149,9 @@
           <w:color w:val="000000" w:themeColor="text1"/>
           <w:u w:val="single"/>
         </w:rPr>
-      </w:pPr>
-      <w:r>
-        <w:rPr>
-          <w:rFonts w:ascii="Bookman Old Style" w:hAnsi="Bookman Old Style"/>
-          <w:color w:val="000000" w:themeColor="text1"/>
-        </w:rPr>
-        <w:t xml:space="preserve">Fecha reclamación: </w:t>
+        <w:t>fecha_reclamacion</w:t>
       </w:r>
+      <w:proofErr w:type="spellEnd"/>
       <w:r>
         <w:rPr>
           <w:rFonts w:ascii="Bookman Old Style" w:hAnsi="Bookman Old Style"/>
@@ -139,17 +160,7 @@
           <w:color w:val="000000" w:themeColor="text1"/>
           <w:u w:val="single"/>
         </w:rPr>
-        <w:t>12 DE JUNIO DE 2026</w:t>
-      </w:r>
-      <w:r>
-        <w:rPr>
-          <w:rFonts w:ascii="Bookman Old Style" w:hAnsi="Bookman Old Style"/>
-          <w:b/>
-          <w:bCs/>
-          <w:color w:val="000000" w:themeColor="text1"/>
-          <w:u w:val="single"/>
-        </w:rPr>
-        <w:t xml:space="preserve"> </w:t>
+        <w:t>}}</w:t>
       </w:r>
     </w:p>
     <w:p>
@@ -1153,6 +1164,12 @@
               <w:t>celular_conductor</w:t>
             </w:r>
             <w:proofErr w:type="spellEnd"/>
+            <w:r>
+              <w:rPr>
+                <w:sz w:val="20"/>
+              </w:rPr>
+              <w:t>}</w:t>
+            </w:r>
             <w:r>
               <w:rPr>
                 <w:sz w:val="20"/>
@@ -1559,7 +1576,7 @@
               <w:rPr>
                 <w:sz w:val="20"/>
               </w:rPr>
-              <w:t>{{afectado1_marca}} {{afectado1_clase}}</w:t>
+              <w:t xml:space="preserve">{{afectado1_marca}} </w:t>
             </w:r>
           </w:p>
         </w:tc>
@@ -1852,7 +1869,7 @@
       </w:r>
       <w:proofErr w:type="spellStart"/>
       <w:r>
-        <w:t>relato_accidente</w:t>
+        <w:t>relato_hechos</w:t>
       </w:r>
       <w:proofErr w:type="spellEnd"/>
       <w:r>
@@ -1887,7 +1904,6 @@
           <w:rFonts w:ascii="Bookman Old Style" w:hAnsi="Bookman Old Style"/>
           <w:b/>
         </w:rPr>
-        <w:lastRenderedPageBreak/>
         <w:t xml:space="preserve">DAÑOS </w:t>
       </w:r>
       <w:r>
@@ -1919,6 +1935,7 @@
         <w:jc w:val="both"/>
       </w:pPr>
       <w:r>
+        <w:lastRenderedPageBreak/>
         <w:t>{{</w:t>
       </w:r>
       <w:proofErr w:type="spellStart"/>
@@ -4689,6 +4706,7 @@
   <w:style w:type="character" w:default="1" w:styleId="Fuentedeprrafopredeter">
     <w:name w:val="Default Paragraph Font"/>
     <w:uiPriority w:val="1"/>
+    <w:semiHidden/>
     <w:unhideWhenUsed/>
   </w:style>
   <w:style w:type="table" w:default="1" w:styleId="Tablanormal">

</xml_diff>